<commit_message>
Fix references: remove fabricated [2], complete [3] venue, fix [4] DOI/venue, renumber all
</commit_message>
<xml_diff>
--- a/DSCI551_Final_Report.docx
+++ b/DSCI551_Final_Report.docx
@@ -235,6 +235,9 @@
     <w:p>
       <w:pPr>
         <w:pStyle w:val="Heading1"/>
+        <w:tabs>
+          <w:tab w:val="right" w:pos="9360"/>
+        </w:tabs>
         <w:spacing w:after="120"/>
         <w:rPr>
           <w:rFonts w:ascii="Times New Roman" w:hAnsi="Times New Roman" w:cs="Times New Roman"/>
@@ -246,6 +249,12 @@
         </w:rPr>
         <w:lastRenderedPageBreak/>
         <w:t>Table of Contents</w:t>
+      </w:r>
+      <w:r>
+        <w:rPr>
+          <w:rFonts w:ascii="Times New Roman" w:hAnsi="Times New Roman" w:cs="Times New Roman"/>
+        </w:rPr>
+        <w:tab/>
       </w:r>
     </w:p>
     <w:p>
@@ -828,115 +837,17 @@
         </w:rPr>
       </w:pPr>
       <w:r>
-        <w:rPr>
-          <w:rFonts w:cs="Times New Roman"/>
-        </w:rPr>
-        <w:t>DuckDB is a column-oriented OLAP database designed specifically for analytical workloads. It stores each column as a contiguous block on disk, so a query that touches three columns reads only those three blocks. DuckDB also employs vectorized query execution, where data is processed in small batches (vectors of 2048 values) that fit in CPU registers, maximizing cache utilization and enabling SIMD parallelism. For educational data science, where the workload is exploratory and aggregation-driven, DuckDB offers a compelling alternative to both traditional RDBMS and big-data frameworks [1] [3].</w:t>
-      </w:r>
-    </w:p>
-    <w:p>
-      <w:pPr>
-        <w:rPr>
-          <w:rFonts w:cs="Times New Roman"/>
-        </w:rPr>
-      </w:pPr>
-      <w:r>
-        <w:rPr>
-          <w:rFonts w:cs="Times New Roman"/>
-        </w:rPr>
-        <w:t>This project builds a learning analytics backend using DuckDB over the Open University Learning Analytics Dataset (OULAD). The dataset contains 10.6 million VLE interaction records linked to student demographic data, assessment scores, and course registration information across 7 relational tables.</w:t>
-      </w:r>
-      <w:r>
-        <w:rPr>
-          <w:rFonts w:cs="Times New Roman"/>
-          <w:lang w:eastAsia="zh-CN"/>
-        </w:rPr>
-        <w:t xml:space="preserve"> I </w:t>
-      </w:r>
-      <w:r>
-        <w:rPr>
-          <w:rFonts w:cs="Times New Roman"/>
-        </w:rPr>
-        <w:t xml:space="preserve">execute five analytical queries that mirror real-world educational data analysis tasks: engagement trends over a course term, comparison of interaction patterns across modules, high-engagement identification, multi-table correlation between interactions and assessment outcomes, and aggregate interaction summaries by resource type. </w:t>
-      </w:r>
-      <w:r>
-        <w:rPr>
-          <w:rFonts w:cs="Times New Roman"/>
-          <w:lang w:eastAsia="zh-CN"/>
-        </w:rPr>
-        <w:t xml:space="preserve">I </w:t>
-      </w:r>
-      <w:r>
-        <w:rPr>
-          <w:rFonts w:cs="Times New Roman"/>
-        </w:rPr>
-        <w:t xml:space="preserve">analyze </w:t>
-      </w:r>
-      <w:proofErr w:type="spellStart"/>
-      <w:r>
-        <w:rPr>
-          <w:rFonts w:cs="Times New Roman"/>
-        </w:rPr>
-        <w:t>DuckDB</w:t>
-      </w:r>
-      <w:r>
-        <w:rPr>
-          <w:rFonts w:cs="Times New Roman"/>
-        </w:rPr>
-        <w:t>’</w:t>
-      </w:r>
-      <w:r>
-        <w:rPr>
-          <w:rFonts w:cs="Times New Roman"/>
-        </w:rPr>
-        <w:t>s</w:t>
-      </w:r>
-      <w:proofErr w:type="spellEnd"/>
-      <w:r>
-        <w:rPr>
-          <w:rFonts w:cs="Times New Roman"/>
-        </w:rPr>
-        <w:t xml:space="preserve"> internal execution plans to understand why columnar processing delivers such dramatic performance advantages. </w:t>
-      </w:r>
-      <w:r>
-        <w:rPr>
-          <w:rFonts w:cs="Times New Roman"/>
-          <w:lang w:eastAsia="zh-CN"/>
-        </w:rPr>
-        <w:t>I</w:t>
-      </w:r>
-      <w:r>
-        <w:rPr>
-          <w:rFonts w:cs="Times New Roman"/>
-        </w:rPr>
-        <w:t xml:space="preserve"> then benchmark </w:t>
-      </w:r>
-      <w:proofErr w:type="spellStart"/>
-      <w:r>
-        <w:rPr>
-          <w:rFonts w:cs="Times New Roman"/>
-        </w:rPr>
-        <w:t>DuckDB</w:t>
-      </w:r>
-      <w:proofErr w:type="spellEnd"/>
-      <w:r>
-        <w:rPr>
-          <w:rFonts w:cs="Times New Roman"/>
-        </w:rPr>
-        <w:t xml:space="preserve"> against MySQL 9.6 on identical queries and hardware, documenting speedups of 192x to 618x. Finally, </w:t>
-      </w:r>
-      <w:r>
-        <w:rPr>
-          <w:rFonts w:cs="Times New Roman"/>
-          <w:lang w:eastAsia="zh-CN"/>
-        </w:rPr>
-        <w:t xml:space="preserve">I </w:t>
-      </w:r>
-      <w:r>
-        <w:rPr>
-          <w:rFonts w:cs="Times New Roman"/>
-        </w:rPr>
-        <w:t>discuss limitations, lessons learned, and the implications of columnar storage for learning analytics infrastructure at scale [4].</w:t>
+        <w:t>DuckDB is a column-oriented OLAP database designed specifically for analytical workloads. It stores each column as a contiguous block on disk, so a query that touches three columns reads only those three blocks. DuckDB also employs vectorized query execution, where data is processed in small batches (vectors of 2048 values) that fit in CPU registers, maximizing cache utilization and enabling SIMD parallelism. For educational data science, where the workload is exploratory and aggregation-driven, DuckDB offers a compelling alternative to both traditional RDBMS and big-data frameworks [1] [2].</w:t>
+      </w:r>
+    </w:p>
+    <w:p>
+      <w:pPr>
+        <w:rPr>
+          <w:rFonts w:cs="Times New Roman"/>
+        </w:rPr>
+      </w:pPr>
+      <w:r>
+        <w:t>This project builds a learning analytics backend using DuckDB over the Open University Learning Analytics Dataset (OULAD). The dataset contains 10.6 million VLE interaction records linked to student demographic data, assessment scores, and course registration information across 7 relational tables. I execute five analytical queries that mirror real-world educational data analysis tasks: engagement trends over a course term, comparison of interaction patterns across modules, high-engagement identification, multi-table correlation between interactions and assessment outcomes, and aggregate interaction summaries by resource type. I analyze DuckDB’s internal execution plans to understand why columnar processing delivers such dramatic performance advantages. I then benchmark DuckDB against MySQL 9.6 on identical queries and hardware, documenting speedups of 192x to 618x. Finally, I discuss limitations, lessons learned, and the implications of columnar storage for learning analytics infrastructure at scale [3].</w:t>
       </w:r>
     </w:p>
     <w:p>
@@ -1155,10 +1066,7 @@
         </w:rPr>
       </w:pPr>
       <w:r>
-        <w:rPr>
-          <w:rFonts w:cs="Times New Roman"/>
-        </w:rPr>
-        <w:t>We loaded the 454 MB studentVle CSV (10.6M rows, 7 columns) into DuckDB and measured the on-disk size. DuckDB stored the same data in approximately 62 MB, a 7.3x compression ratio. This compression comes from multiple techniques applied automatically per column based on data characteristics: [6].</w:t>
+        <w:t>We loaded the 454 MB studentVle CSV (10.6M rows, 7 columns) into DuckDB and measured the on-disk size. DuckDB stored the same data in approximately 62 MB, a 7.3x compression ratio. This compression comes from multiple techniques applied automatically per column based on data characteristics: [5].</w:t>
       </w:r>
     </w:p>
     <w:p>
@@ -3628,13 +3536,19 @@
         <w:rPr>
           <w:rFonts w:cs="Times New Roman"/>
         </w:rPr>
-        <w:t xml:space="preserve">[1] M. Raasveldt and H. Muhleisen, </w:t>
-      </w:r>
-      <w:r>
-        <w:rPr>
-          <w:rFonts w:cs="Times New Roman"/>
-        </w:rPr>
-        <w:t>“</w:t>
+        <w:t xml:space="preserve">[1] </w:t>
+      </w:r>
+      <w:r>
+        <w:rPr>
+          <w:rFonts w:cs="Times New Roman"/>
+        </w:rPr>
+        <w:t>H. Muhleisen and M. Raasveldt</w:t>
+      </w:r>
+      <w:r>
+        <w:rPr>
+          <w:rFonts w:cs="Times New Roman"/>
+        </w:rPr>
+        <w:t xml:space="preserve">. 2019. </w:t>
       </w:r>
       <w:proofErr w:type="spellStart"/>
       <w:r>
@@ -3648,80 +3562,17 @@
         <w:rPr>
           <w:rFonts w:cs="Times New Roman"/>
         </w:rPr>
-        <w:t>: An In-Process Analytical Database Management System,</w:t>
-      </w:r>
-      <w:r>
-        <w:rPr>
-          <w:rFonts w:cs="Times New Roman"/>
-        </w:rPr>
-        <w:t>”</w:t>
-      </w:r>
-      <w:r>
-        <w:rPr>
-          <w:rFonts w:cs="Times New Roman"/>
-        </w:rPr>
-        <w:t xml:space="preserve"> in Proceedings of the 2019 ACM SIGMOD International Conference on Management of Data, Amsterdam, Netherlands, 2019, pp. 1809–1812.</w:t>
-      </w:r>
-    </w:p>
-    <w:p>
-      <w:pPr>
+        <w:t>: an Embeddable Analytical Database. In Proceedings of the 2019 International Conference on Management of Data (SIGMOD '19). Association for Computing Machinery, New York, NY, USA, 1981–1984. https://doi.org/10.1145/3299869.3320212</w:t>
+      </w:r>
+    </w:p>
+    <w:p>
+      <w:pPr>
+        <w:spacing w:after="0" w:line="20" w:lineRule="exact"/>
         <w:ind w:left="720" w:hanging="720"/>
         <w:rPr>
           <w:rFonts w:cs="Times New Roman"/>
         </w:rPr>
       </w:pPr>
-      <w:r>
-        <w:rPr>
-          <w:rFonts w:cs="Times New Roman"/>
-        </w:rPr>
-        <w:t xml:space="preserve">[2] H. Muhleisen and M. Raasveldt, </w:t>
-      </w:r>
-      <w:r>
-        <w:rPr>
-          <w:rFonts w:cs="Times New Roman"/>
-        </w:rPr>
-        <w:t>“</w:t>
-      </w:r>
-      <w:proofErr w:type="spellStart"/>
-      <w:r>
-        <w:rPr>
-          <w:rFonts w:cs="Times New Roman"/>
-        </w:rPr>
-        <w:t>DuckDB</w:t>
-      </w:r>
-      <w:proofErr w:type="spellEnd"/>
-      <w:r>
-        <w:rPr>
-          <w:rFonts w:cs="Times New Roman"/>
-        </w:rPr>
-        <w:t>: Extending SQLite with Columnar and Vectorized Support,</w:t>
-      </w:r>
-      <w:r>
-        <w:rPr>
-          <w:rFonts w:cs="Times New Roman"/>
-        </w:rPr>
-        <w:t>”</w:t>
-      </w:r>
-      <w:r>
-        <w:rPr>
-          <w:rFonts w:cs="Times New Roman"/>
-        </w:rPr>
-        <w:t xml:space="preserve"> in </w:t>
-      </w:r>
-      <w:proofErr w:type="spellStart"/>
-      <w:r>
-        <w:rPr>
-          <w:rFonts w:cs="Times New Roman"/>
-        </w:rPr>
-        <w:t>Datenbanksysteme</w:t>
-      </w:r>
-      <w:proofErr w:type="spellEnd"/>
-      <w:r>
-        <w:rPr>
-          <w:rFonts w:cs="Times New Roman"/>
-        </w:rPr>
-        <w:t xml:space="preserve"> für Business, Technologie und Web (BTW), Vienna, Austria, 2019.</w:t>
-      </w:r>
     </w:p>
     <w:p>
       <w:pPr>
@@ -3731,42 +3582,7 @@
         </w:rPr>
       </w:pPr>
       <w:r>
-        <w:rPr>
-          <w:rFonts w:cs="Times New Roman"/>
-        </w:rPr>
-        <w:t xml:space="preserve">[3] P. Boncz, M. Zukowski, and N. Nes, </w:t>
-      </w:r>
-      <w:r>
-        <w:rPr>
-          <w:rFonts w:cs="Times New Roman"/>
-        </w:rPr>
-        <w:t>“</w:t>
-      </w:r>
-      <w:proofErr w:type="spellStart"/>
-      <w:r>
-        <w:rPr>
-          <w:rFonts w:cs="Times New Roman"/>
-        </w:rPr>
-        <w:t>MonetDB</w:t>
-      </w:r>
-      <w:proofErr w:type="spellEnd"/>
-      <w:r>
-        <w:rPr>
-          <w:rFonts w:cs="Times New Roman"/>
-        </w:rPr>
-        <w:t>/X100: Hyper-Pipelining Query Execution,</w:t>
-      </w:r>
-      <w:r>
-        <w:rPr>
-          <w:rFonts w:cs="Times New Roman"/>
-        </w:rPr>
-        <w:t>”</w:t>
-      </w:r>
-      <w:r>
-        <w:rPr>
-          <w:rFonts w:cs="Times New Roman"/>
-        </w:rPr>
-        <w:t xml:space="preserve"> in Proceedings of the 2005 CIDR Conference, Asilomar, CA, 2005.</w:t>
+        <w:t>[2] P. Boncz, M. Zukowski, and N. Nes, "MonetDB/X100: Hyper-Pipelining Query Execution," in Proceedings of the 2nd Biennial Conference on Innovative Data Systems Research (CIDR), Asilomar, CA, 2005, pp. 225-237.</w:t>
       </w:r>
     </w:p>
     <w:p>
@@ -3774,51 +3590,11 @@
         <w:ind w:left="720" w:hanging="720"/>
         <w:rPr>
           <w:rFonts w:cs="Times New Roman"/>
-        </w:rPr>
-      </w:pPr>
-      <w:r>
-        <w:rPr>
-          <w:rFonts w:cs="Times New Roman"/>
-        </w:rPr>
-        <w:t xml:space="preserve">[4] J. Kuzilek, M. Hlosta, and Z. </w:t>
-      </w:r>
-      <w:proofErr w:type="spellStart"/>
-      <w:r>
-        <w:rPr>
-          <w:rFonts w:cs="Times New Roman"/>
-        </w:rPr>
-        <w:t>Zdrahal</w:t>
-      </w:r>
-      <w:proofErr w:type="spellEnd"/>
-      <w:r>
-        <w:rPr>
-          <w:rFonts w:cs="Times New Roman"/>
-        </w:rPr>
-        <w:t xml:space="preserve">, </w:t>
-      </w:r>
-      <w:r>
-        <w:rPr>
-          <w:rFonts w:cs="Times New Roman"/>
-        </w:rPr>
-        <w:t>“</w:t>
-      </w:r>
-      <w:r>
-        <w:rPr>
-          <w:rFonts w:cs="Times New Roman"/>
-        </w:rPr>
-        <w:t>Open University Learning Analytics Dataset,</w:t>
-      </w:r>
-      <w:r>
-        <w:rPr>
-          <w:rFonts w:cs="Times New Roman"/>
-        </w:rPr>
-        <w:t>”</w:t>
-      </w:r>
-      <w:r>
-        <w:rPr>
-          <w:rFonts w:cs="Times New Roman"/>
-        </w:rPr>
-        <w:t xml:space="preserve"> Scientific Data, vol. 4, no. 1, pp. 1–8, 2017.</w:t>
+          <w:lang w:eastAsia="zh-CN"/>
+        </w:rPr>
+      </w:pPr>
+      <w:r>
+        <w:t>[3] J. Kuzilek, M. Hlosta, and Z. Zdrahal, "Open University Learning Analytics Dataset," Scientific Data, vol. 4, art. no. 170171, 2017, doi: 10.1038/sdata.2017.171.</w:t>
       </w:r>
     </w:p>
     <w:p>
@@ -3829,34 +3605,7 @@
         </w:rPr>
       </w:pPr>
       <w:r>
-        <w:rPr>
-          <w:rFonts w:cs="Times New Roman"/>
-        </w:rPr>
-        <w:t xml:space="preserve">[5] A. Lamb et al., </w:t>
-      </w:r>
-      <w:r>
-        <w:rPr>
-          <w:rFonts w:cs="Times New Roman"/>
-        </w:rPr>
-        <w:t>“</w:t>
-      </w:r>
-      <w:r>
-        <w:rPr>
-          <w:rFonts w:cs="Times New Roman"/>
-        </w:rPr>
-        <w:t>The Vertica Analytic Database: C-Store 7 Years Later,</w:t>
-      </w:r>
-      <w:r>
-        <w:rPr>
-          <w:rFonts w:cs="Times New Roman"/>
-        </w:rPr>
-        <w:t>”</w:t>
-      </w:r>
-      <w:r>
-        <w:rPr>
-          <w:rFonts w:cs="Times New Roman"/>
-        </w:rPr>
-        <w:t xml:space="preserve"> Proceedings of the VLDB Endowment, vol. 5, no. 12, pp. 1790–1801, 2012.</w:t>
+        <w:t>[4] A. Lamb et al., “The Vertica Analytic Database: C-Store 7 Years Later,” Proceedings of the VLDB Endowment, vol. 5, no. 12, pp. 1790–1801, 2012.</w:t>
       </w:r>
     </w:p>
     <w:p>
@@ -3867,62 +3616,16 @@
         </w:rPr>
       </w:pPr>
       <w:r>
-        <w:rPr>
-          <w:rFonts w:cs="Times New Roman"/>
-        </w:rPr>
-        <w:t xml:space="preserve">[6] D. J. Abadi, P. A. Boncz, and S. </w:t>
-      </w:r>
-      <w:proofErr w:type="spellStart"/>
-      <w:r>
-        <w:rPr>
-          <w:rFonts w:cs="Times New Roman"/>
-        </w:rPr>
-        <w:t>Harizopoulos</w:t>
-      </w:r>
-      <w:proofErr w:type="spellEnd"/>
-      <w:r>
-        <w:rPr>
-          <w:rFonts w:cs="Times New Roman"/>
-        </w:rPr>
-        <w:t xml:space="preserve">, </w:t>
-      </w:r>
-      <w:r>
-        <w:rPr>
-          <w:rFonts w:cs="Times New Roman"/>
-        </w:rPr>
-        <w:t>“</w:t>
-      </w:r>
-      <w:r>
-        <w:rPr>
-          <w:rFonts w:cs="Times New Roman"/>
-        </w:rPr>
-        <w:t>Column-Oriented Database Systems,</w:t>
-      </w:r>
-      <w:r>
-        <w:rPr>
-          <w:rFonts w:cs="Times New Roman"/>
-        </w:rPr>
-        <w:t>”</w:t>
-      </w:r>
-      <w:r>
-        <w:rPr>
-          <w:rFonts w:cs="Times New Roman"/>
-        </w:rPr>
-        <w:t xml:space="preserve"> Proceedings of the VLDB Endowment, vol. 2, no. 2, pp. 1664–1665, 2009.</w:t>
-      </w:r>
-    </w:p>
-    <w:p>
-      <w:pPr>
-        <w:rPr>
-          <w:rFonts w:cs="Times New Roman"/>
-        </w:rPr>
-      </w:pPr>
-      <w:r>
-        <w:rPr>
-          <w:rFonts w:cs="Times New Roman"/>
-        </w:rPr>
-        <w:br w:type="page"/>
-      </w:r>
+        <w:t>[5] D. J. Abadi, P. A. Boncz, and S. Harizopoulos, “Column-Oriented Database Systems,” Proceedings of the VLDB Endowment, vol. 2, no. 2, pp. 1664–1665, 2009.</w:t>
+      </w:r>
+    </w:p>
+    <w:p>
+      <w:pPr>
+        <w:spacing w:after="0" w:line="20" w:lineRule="exact"/>
+        <w:rPr>
+          <w:rFonts w:cs="Times New Roman"/>
+        </w:rPr>
+      </w:pPr>
     </w:p>
     <w:p>
       <w:pPr>
@@ -3936,7 +3639,6 @@
         <w:rPr>
           <w:rFonts w:ascii="Times New Roman" w:hAnsi="Times New Roman" w:cs="Times New Roman"/>
         </w:rPr>
-        <w:lastRenderedPageBreak/>
         <w:t>Appendix A: AI Usage Disclosure</w:t>
       </w:r>
     </w:p>
@@ -3945,29 +3647,138 @@
         <w:spacing w:after="120"/>
         <w:rPr>
           <w:rFonts w:cs="Times New Roman"/>
-        </w:rPr>
-      </w:pPr>
-      <w:r>
-        <w:rPr>
-          <w:rFonts w:cs="Times New Roman"/>
-          <w:sz w:val="22"/>
-        </w:rPr>
-        <w:t>Claude (Anthropic, Opus 4.6) was used as a coding assistant during this project</w:t>
+          <w:szCs w:val="24"/>
+        </w:rPr>
+      </w:pPr>
+      <w:r>
+        <w:rPr>
+          <w:rFonts w:cs="Times New Roman"/>
+          <w:szCs w:val="24"/>
+        </w:rPr>
+        <w:t>Claude (Anthropic, Opus 4.6) was used during this project in the following capacities:</w:t>
+      </w:r>
+    </w:p>
+    <w:p>
+      <w:pPr>
+        <w:spacing w:after="120"/>
+        <w:rPr>
+          <w:rFonts w:cs="Times New Roman"/>
+          <w:szCs w:val="24"/>
+        </w:rPr>
+      </w:pPr>
+      <w:r>
+        <w:rPr>
+          <w:rFonts w:cs="Times New Roman"/>
+          <w:szCs w:val="24"/>
+        </w:rPr>
+        <w:t xml:space="preserve">1. Code assistance: The AI helped debug syntax errors in the </w:t>
+      </w:r>
+      <w:proofErr w:type="spellStart"/>
+      <w:r>
+        <w:rPr>
+          <w:rFonts w:cs="Times New Roman"/>
+          <w:szCs w:val="24"/>
+        </w:rPr>
+        <w:t>Jupyter</w:t>
+      </w:r>
+      <w:proofErr w:type="spellEnd"/>
+      <w:r>
+        <w:rPr>
+          <w:rFonts w:cs="Times New Roman"/>
+          <w:szCs w:val="24"/>
+        </w:rPr>
+        <w:t xml:space="preserve"> notebook</w:t>
       </w:r>
       <w:r>
         <w:rPr>
           <w:rFonts w:cs="Times New Roman" w:hint="eastAsia"/>
-          <w:sz w:val="22"/>
+          <w:szCs w:val="24"/>
           <w:lang w:eastAsia="zh-CN"/>
         </w:rPr>
+        <w:t xml:space="preserve">, </w:t>
+      </w:r>
+      <w:r>
+        <w:rPr>
+          <w:rFonts w:cs="Times New Roman"/>
+          <w:szCs w:val="24"/>
+        </w:rPr>
+        <w:t>refactor hardcoded file paths to use relative paths, and generate boilerplate code for benchmark measurements.</w:t>
+      </w:r>
+    </w:p>
+    <w:p>
+      <w:pPr>
+        <w:spacing w:after="120"/>
+        <w:rPr>
+          <w:rFonts w:cs="Times New Roman"/>
+          <w:szCs w:val="24"/>
+        </w:rPr>
+      </w:pPr>
+      <w:r>
+        <w:rPr>
+          <w:rFonts w:cs="Times New Roman"/>
+          <w:szCs w:val="24"/>
+        </w:rPr>
+        <w:t xml:space="preserve">2. Report </w:t>
+      </w:r>
+      <w:r>
+        <w:rPr>
+          <w:rFonts w:cs="Times New Roman" w:hint="eastAsia"/>
+          <w:szCs w:val="24"/>
+          <w:lang w:eastAsia="zh-CN"/>
+        </w:rPr>
+        <w:t>revising</w:t>
+      </w:r>
+      <w:r>
+        <w:rPr>
+          <w:rFonts w:cs="Times New Roman"/>
+          <w:szCs w:val="24"/>
+        </w:rPr>
+        <w:t xml:space="preserve">: The AI was used to suggest structural </w:t>
+      </w:r>
+      <w:r>
+        <w:rPr>
+          <w:rFonts w:cs="Times New Roman" w:hint="eastAsia"/>
+          <w:szCs w:val="24"/>
+          <w:lang w:eastAsia="zh-CN"/>
+        </w:rPr>
+        <w:t>outline</w:t>
+      </w:r>
+      <w:r>
+        <w:rPr>
+          <w:rFonts w:cs="Times New Roman"/>
+          <w:szCs w:val="24"/>
+        </w:rPr>
+        <w:t>, expand technical explanations</w:t>
+      </w:r>
+      <w:r>
+        <w:rPr>
+          <w:rFonts w:cs="Times New Roman" w:hint="eastAsia"/>
+          <w:szCs w:val="24"/>
+          <w:lang w:eastAsia="zh-CN"/>
+        </w:rPr>
         <w:t xml:space="preserve">. </w:t>
       </w:r>
       <w:r>
         <w:rPr>
           <w:rFonts w:cs="Times New Roman"/>
-          <w:sz w:val="22"/>
-        </w:rPr>
-        <w:t>The AI tool was used in the following capacities:</w:t>
+          <w:szCs w:val="24"/>
+        </w:rPr>
+        <w:t xml:space="preserve">The author </w:t>
+      </w:r>
+      <w:r>
+        <w:rPr>
+          <w:rFonts w:cs="Times New Roman" w:hint="eastAsia"/>
+          <w:szCs w:val="24"/>
+          <w:lang w:eastAsia="zh-CN"/>
+        </w:rPr>
+        <w:t xml:space="preserve">wrote, </w:t>
+      </w:r>
+      <w:r>
+        <w:rPr>
+          <w:rFonts w:cs="Times New Roman"/>
+          <w:szCs w:val="24"/>
+        </w:rPr>
+        <w:t>reviewed, revised, and takes full responsibility for all content, analysis, and conclusions presented in this report.</w:t>
       </w:r>
     </w:p>
     <w:p>
@@ -3975,45 +3786,45 @@
         <w:spacing w:after="120"/>
         <w:rPr>
           <w:rFonts w:cs="Times New Roman"/>
-        </w:rPr>
-      </w:pPr>
-      <w:r>
-        <w:rPr>
-          <w:rFonts w:cs="Times New Roman"/>
-          <w:sz w:val="22"/>
-        </w:rPr>
-        <w:t xml:space="preserve">1. Code assistance: The AI helped debug syntax errors in the </w:t>
-      </w:r>
-      <w:proofErr w:type="spellStart"/>
-      <w:r>
-        <w:rPr>
-          <w:rFonts w:cs="Times New Roman"/>
-          <w:sz w:val="22"/>
-        </w:rPr>
-        <w:t>Jupyter</w:t>
-      </w:r>
-      <w:proofErr w:type="spellEnd"/>
-      <w:r>
-        <w:rPr>
-          <w:rFonts w:cs="Times New Roman"/>
-          <w:sz w:val="22"/>
-        </w:rPr>
-        <w:t xml:space="preserve"> notebook</w:t>
+          <w:szCs w:val="24"/>
+        </w:rPr>
+      </w:pPr>
+      <w:r>
+        <w:rPr>
+          <w:rFonts w:cs="Times New Roman"/>
+          <w:szCs w:val="24"/>
+        </w:rPr>
+        <w:t xml:space="preserve">3. </w:t>
       </w:r>
       <w:r>
         <w:rPr>
           <w:rFonts w:cs="Times New Roman" w:hint="eastAsia"/>
-          <w:sz w:val="22"/>
+          <w:szCs w:val="24"/>
           <w:lang w:eastAsia="zh-CN"/>
         </w:rPr>
-        <w:t xml:space="preserve">, </w:t>
-      </w:r>
-      <w:r>
-        <w:rPr>
-          <w:rFonts w:cs="Times New Roman"/>
-          <w:sz w:val="22"/>
-        </w:rPr>
-        <w:t>refactor hardcoded file paths to use relative paths, and generate boilerplate code for benchmark measurements.</w:t>
+        <w:t>Citation management</w:t>
+      </w:r>
+      <w:r>
+        <w:rPr>
+          <w:rFonts w:cs="Times New Roman"/>
+          <w:szCs w:val="24"/>
+        </w:rPr>
+        <w:t xml:space="preserve">: The AI helped format in-text citations in IEEE style. All references were </w:t>
+      </w:r>
+      <w:r>
+        <w:rPr>
+          <w:rFonts w:cs="Times New Roman" w:hint="eastAsia"/>
+          <w:szCs w:val="24"/>
+          <w:lang w:eastAsia="zh-CN"/>
+        </w:rPr>
+        <w:t xml:space="preserve">selected </w:t>
+      </w:r>
+      <w:r>
+        <w:rPr>
+          <w:rFonts w:cs="Times New Roman"/>
+          <w:szCs w:val="24"/>
+        </w:rPr>
+        <w:t>verified by the author.</w:t>
       </w:r>
     </w:p>
     <w:p>
@@ -4021,74 +3832,43 @@
         <w:spacing w:after="120"/>
         <w:rPr>
           <w:rFonts w:cs="Times New Roman"/>
-        </w:rPr>
-      </w:pPr>
-      <w:r>
-        <w:rPr>
-          <w:rFonts w:cs="Times New Roman"/>
-          <w:sz w:val="22"/>
-        </w:rPr>
-        <w:t xml:space="preserve">2. Report </w:t>
-      </w:r>
-      <w:r>
-        <w:rPr>
-          <w:rFonts w:cs="Times New Roman" w:hint="eastAsia"/>
-          <w:sz w:val="22"/>
-          <w:lang w:eastAsia="zh-CN"/>
-        </w:rPr>
-        <w:t>revising</w:t>
-      </w:r>
-      <w:r>
-        <w:rPr>
-          <w:rFonts w:cs="Times New Roman"/>
-          <w:sz w:val="22"/>
-        </w:rPr>
-        <w:t xml:space="preserve">: The AI was used to suggest structural </w:t>
-      </w:r>
-      <w:r>
-        <w:rPr>
-          <w:rFonts w:cs="Times New Roman" w:hint="eastAsia"/>
-          <w:sz w:val="22"/>
-          <w:lang w:eastAsia="zh-CN"/>
-        </w:rPr>
-        <w:t>outline</w:t>
-      </w:r>
-      <w:r>
-        <w:rPr>
-          <w:rFonts w:cs="Times New Roman"/>
-          <w:sz w:val="22"/>
-        </w:rPr>
-        <w:t>, expand technical explanations</w:t>
-      </w:r>
-      <w:r>
-        <w:rPr>
-          <w:rFonts w:cs="Times New Roman" w:hint="eastAsia"/>
-          <w:sz w:val="22"/>
-          <w:lang w:eastAsia="zh-CN"/>
-        </w:rPr>
-        <w:t xml:space="preserve">. </w:t>
-      </w:r>
-      <w:r>
-        <w:rPr>
-          <w:rFonts w:cs="Times New Roman"/>
-          <w:sz w:val="22"/>
-        </w:rPr>
-        <w:t xml:space="preserve">The author </w:t>
-      </w:r>
-      <w:r>
-        <w:rPr>
-          <w:rFonts w:cs="Times New Roman" w:hint="eastAsia"/>
-          <w:sz w:val="22"/>
-          <w:lang w:eastAsia="zh-CN"/>
-        </w:rPr>
-        <w:t xml:space="preserve">wrote, </w:t>
-      </w:r>
-      <w:r>
-        <w:rPr>
-          <w:rFonts w:cs="Times New Roman"/>
-          <w:sz w:val="22"/>
-        </w:rPr>
-        <w:t>reviewed, revised, and takes full responsibility for all content, analysis, and conclusions presented in this report.</w:t>
+          <w:szCs w:val="24"/>
+        </w:rPr>
+      </w:pPr>
+      <w:r>
+        <w:rPr>
+          <w:rFonts w:cs="Times New Roman"/>
+          <w:szCs w:val="24"/>
+        </w:rPr>
+        <w:t>The AI tool was not used to fabricate data, generate benchmark results, or replace the author</w:t>
+      </w:r>
+      <w:r>
+        <w:rPr>
+          <w:rFonts w:cs="Times New Roman"/>
+          <w:szCs w:val="24"/>
+        </w:rPr>
+        <w:t>’</w:t>
+      </w:r>
+      <w:r>
+        <w:rPr>
+          <w:rFonts w:cs="Times New Roman"/>
+          <w:szCs w:val="24"/>
+        </w:rPr>
+        <w:t>s own understanding of the material. All queries, analyses, and interpretations reflect the author</w:t>
+      </w:r>
+      <w:r>
+        <w:rPr>
+          <w:rFonts w:cs="Times New Roman"/>
+          <w:szCs w:val="24"/>
+        </w:rPr>
+        <w:t>’</w:t>
+      </w:r>
+      <w:r>
+        <w:rPr>
+          <w:rFonts w:cs="Times New Roman"/>
+          <w:szCs w:val="24"/>
+        </w:rPr>
+        <w:t>s independent work. The AI served solely as a productivity tool, analogous to using spell-check, grammar checkers, or template-based formatting in traditional writing workflows.</w:t>
       </w:r>
     </w:p>
     <w:p>
@@ -4096,99 +3876,27 @@
         <w:spacing w:after="120"/>
         <w:rPr>
           <w:rFonts w:cs="Times New Roman"/>
-        </w:rPr>
-      </w:pPr>
-      <w:r>
-        <w:rPr>
-          <w:rFonts w:cs="Times New Roman"/>
-          <w:sz w:val="22"/>
-        </w:rPr>
-        <w:t xml:space="preserve">3. </w:t>
-      </w:r>
-      <w:r>
-        <w:rPr>
-          <w:rFonts w:cs="Times New Roman" w:hint="eastAsia"/>
-          <w:sz w:val="22"/>
-          <w:lang w:eastAsia="zh-CN"/>
-        </w:rPr>
-        <w:t>Citation management</w:t>
-      </w:r>
-      <w:r>
-        <w:rPr>
-          <w:rFonts w:cs="Times New Roman"/>
-          <w:sz w:val="22"/>
-        </w:rPr>
-        <w:t>: The AI helped format in-text citations in IEEE style. All references were verified by the author.</w:t>
-      </w:r>
-    </w:p>
-    <w:p>
-      <w:pPr>
-        <w:spacing w:after="120"/>
-        <w:rPr>
-          <w:rFonts w:cs="Times New Roman"/>
-        </w:rPr>
-      </w:pPr>
-      <w:r>
-        <w:rPr>
-          <w:rFonts w:cs="Times New Roman"/>
-          <w:sz w:val="22"/>
-        </w:rPr>
-        <w:t>The AI tool was not used to fabricate data, generate benchmark results, or replace the author</w:t>
-      </w:r>
-      <w:r>
-        <w:rPr>
-          <w:rFonts w:cs="Times New Roman"/>
-          <w:sz w:val="22"/>
+          <w:szCs w:val="24"/>
+        </w:rPr>
+      </w:pPr>
+      <w:r>
+        <w:rPr>
+          <w:rFonts w:cs="Times New Roman"/>
+          <w:szCs w:val="24"/>
+        </w:rPr>
+        <w:t>In accordance with USC</w:t>
+      </w:r>
+      <w:r>
+        <w:rPr>
+          <w:rFonts w:cs="Times New Roman"/>
+          <w:szCs w:val="24"/>
         </w:rPr>
         <w:t>’</w:t>
       </w:r>
       <w:r>
         <w:rPr>
           <w:rFonts w:cs="Times New Roman"/>
-          <w:sz w:val="22"/>
-        </w:rPr>
-        <w:t>s own understanding of the material. All queries, analyses, and interpretations reflect the author</w:t>
-      </w:r>
-      <w:r>
-        <w:rPr>
-          <w:rFonts w:cs="Times New Roman"/>
-          <w:sz w:val="22"/>
-        </w:rPr>
-        <w:t>’</w:t>
-      </w:r>
-      <w:r>
-        <w:rPr>
-          <w:rFonts w:cs="Times New Roman"/>
-          <w:sz w:val="22"/>
-        </w:rPr>
-        <w:t>s independent work. The AI served solely as a productivity tool, analogous to using spell-check, grammar checkers, or template-based formatting in traditional writing workflows.</w:t>
-      </w:r>
-    </w:p>
-    <w:p>
-      <w:pPr>
-        <w:spacing w:after="120"/>
-        <w:rPr>
-          <w:rFonts w:cs="Times New Roman"/>
-        </w:rPr>
-      </w:pPr>
-      <w:r>
-        <w:rPr>
-          <w:rFonts w:cs="Times New Roman"/>
-          <w:sz w:val="22"/>
-        </w:rPr>
-        <w:t>In accordance with USC</w:t>
-      </w:r>
-      <w:r>
-        <w:rPr>
-          <w:rFonts w:cs="Times New Roman"/>
-          <w:sz w:val="22"/>
-        </w:rPr>
-        <w:t>’</w:t>
-      </w:r>
-      <w:r>
-        <w:rPr>
-          <w:rFonts w:cs="Times New Roman"/>
-          <w:sz w:val="22"/>
+          <w:szCs w:val="24"/>
         </w:rPr>
         <w:t>s academic integrity policies, the use of AI assistance is disclosed transparently to maintain the integrity of the learning process and the submitted work.</w:t>
       </w:r>
@@ -4196,6 +3904,7 @@
     <w:sectPr>
       <w:headerReference w:type="even" r:id="rId12"/>
       <w:headerReference w:type="default" r:id="rId13"/>
+      <w:headerReference w:type="first" r:id="rId14"/>
       <w:pgSz w:w="12240" w:h="15840"/>
       <w:pgMar w:top="1440" w:right="1440" w:bottom="1440" w:left="1440" w:header="720" w:footer="720" w:gutter="0"/>
       <w:pgNumType w:start="0"/>
@@ -4317,60 +4026,41 @@
 
 <file path=word/header2.xml><?xml version="1.0" encoding="utf-8"?>
 <w:hdr xmlns:wpc="http://schemas.microsoft.com/office/word/2010/wordprocessingCanvas" xmlns:cx="http://schemas.microsoft.com/office/drawing/2014/chartex" xmlns:cx1="http://schemas.microsoft.com/office/drawing/2015/9/8/chartex" xmlns:cx2="http://schemas.microsoft.com/office/drawing/2015/10/21/chartex" xmlns:cx3="http://schemas.microsoft.com/office/drawing/2016/5/9/chartex" xmlns:cx4="http://schemas.microsoft.com/office/drawing/2016/5/10/chartex" xmlns:cx5="http://schemas.microsoft.com/office/drawing/2016/5/11/chartex" xmlns:cx6="http://schemas.microsoft.com/office/drawing/2016/5/12/chartex" xmlns:cx7="http://schemas.microsoft.com/office/drawing/2016/5/13/chartex" xmlns:cx8="http://schemas.microsoft.com/office/drawing/2016/5/14/chartex" xmlns:mc="http://schemas.openxmlformats.org/markup-compatibility/2006" xmlns:aink="http://schemas.microsoft.com/office/drawing/2016/ink" xmlns:am3d="http://schemas.microsoft.com/office/drawing/2017/model3d" xmlns:o="urn:schemas-microsoft-com:office:office" xmlns:oel="http://schemas.microsoft.com/office/2019/extlst" xmlns:r="http://schemas.openxmlformats.org/officeDocument/2006/relationships" xmlns:m="http://schemas.openxmlformats.org/officeDocument/2006/math" xmlns:v="urn:schemas-microsoft-com:vml" xmlns:wp14="http://schemas.microsoft.com/office/word/2010/wordprocessingDrawing" xmlns:wp="http://schemas.openxmlformats.org/drawingml/2006/wordprocessingDrawing" xmlns:w10="urn:schemas-microsoft-com:office:word" xmlns:w="http://schemas.openxmlformats.org/wordprocessingml/2006/main" xmlns:w14="http://schemas.microsoft.com/office/word/2010/wordml" xmlns:w15="http://schemas.microsoft.com/office/word/2012/wordml" xmlns:w16cex="http://schemas.microsoft.com/office/word/2018/wordml/cex" xmlns:w16cid="http://schemas.microsoft.com/office/word/2016/wordml/cid" xmlns:w16="http://schemas.microsoft.com/office/word/2018/wordml" xmlns:w16du="http://schemas.microsoft.com/office/word/2023/wordml/word16du" xmlns:w16sdtdh="http://schemas.microsoft.com/office/word/2020/wordml/sdtdatahash" xmlns:w16sdtfl="http://schemas.microsoft.com/office/word/2024/wordml/sdtformatlock" xmlns:w16se="http://schemas.microsoft.com/office/word/2015/wordml/symex" xmlns:wpg="http://schemas.microsoft.com/office/word/2010/wordprocessingGroup" xmlns:wpi="http://schemas.microsoft.com/office/word/2010/wordprocessingInk" xmlns:wne="http://schemas.microsoft.com/office/word/2006/wordml" xmlns:wps="http://schemas.microsoft.com/office/word/2010/wordprocessingShape" mc:Ignorable="w14 w15 w16se w16cid w16 w16cex w16sdtdh w16sdtfl w16du wp14">
-  <w:sdt>
-    <w:sdtPr>
+  <w:p>
+    <w:pPr>
+      <w:pStyle w:val="Header"/>
+      <w:ind w:right="360"/>
+      <w:rPr>
+        <w:lang w:eastAsia="zh-CN"/>
+      </w:rPr>
+    </w:pPr>
+    <w:r>
+      <w:rPr>
+        <w:lang w:eastAsia="zh-CN"/>
+      </w:rPr>
+      <w:tab/>
+    </w:r>
+    <w:r>
+      <w:rPr>
+        <w:lang w:eastAsia="zh-CN"/>
+      </w:rPr>
+      <w:tab/>
+    </w:r>
+  </w:p>
+</w:hdr>
+</file>
+
+<file path=word/header3.xml><?xml version="1.0" encoding="utf-8"?>
+<w:hdr xmlns:wpc="http://schemas.microsoft.com/office/word/2010/wordprocessingCanvas" xmlns:cx="http://schemas.microsoft.com/office/drawing/2014/chartex" xmlns:cx1="http://schemas.microsoft.com/office/drawing/2015/9/8/chartex" xmlns:cx2="http://schemas.microsoft.com/office/drawing/2015/10/21/chartex" xmlns:cx3="http://schemas.microsoft.com/office/drawing/2016/5/9/chartex" xmlns:cx4="http://schemas.microsoft.com/office/drawing/2016/5/10/chartex" xmlns:cx5="http://schemas.microsoft.com/office/drawing/2016/5/11/chartex" xmlns:cx6="http://schemas.microsoft.com/office/drawing/2016/5/12/chartex" xmlns:cx7="http://schemas.microsoft.com/office/drawing/2016/5/13/chartex" xmlns:cx8="http://schemas.microsoft.com/office/drawing/2016/5/14/chartex" xmlns:mc="http://schemas.openxmlformats.org/markup-compatibility/2006" xmlns:aink="http://schemas.microsoft.com/office/drawing/2016/ink" xmlns:am3d="http://schemas.microsoft.com/office/drawing/2017/model3d" xmlns:o="urn:schemas-microsoft-com:office:office" xmlns:oel="http://schemas.microsoft.com/office/2019/extlst" xmlns:r="http://schemas.openxmlformats.org/officeDocument/2006/relationships" xmlns:m="http://schemas.openxmlformats.org/officeDocument/2006/math" xmlns:v="urn:schemas-microsoft-com:vml" xmlns:wp14="http://schemas.microsoft.com/office/word/2010/wordprocessingDrawing" xmlns:wp="http://schemas.openxmlformats.org/drawingml/2006/wordprocessingDrawing" xmlns:w10="urn:schemas-microsoft-com:office:word" xmlns:w="http://schemas.openxmlformats.org/wordprocessingml/2006/main" xmlns:w14="http://schemas.microsoft.com/office/word/2010/wordml" xmlns:w15="http://schemas.microsoft.com/office/word/2012/wordml" xmlns:w16cex="http://schemas.microsoft.com/office/word/2018/wordml/cex" xmlns:w16cid="http://schemas.microsoft.com/office/word/2016/wordml/cid" xmlns:w16="http://schemas.microsoft.com/office/word/2018/wordml" xmlns:w16du="http://schemas.microsoft.com/office/word/2023/wordml/word16du" xmlns:w16sdtdh="http://schemas.microsoft.com/office/word/2020/wordml/sdtdatahash" xmlns:w16sdtfl="http://schemas.microsoft.com/office/word/2024/wordml/sdtformatlock" xmlns:w16se="http://schemas.microsoft.com/office/word/2015/wordml/symex" xmlns:wpg="http://schemas.microsoft.com/office/word/2010/wordprocessingGroup" xmlns:wpi="http://schemas.microsoft.com/office/word/2010/wordprocessingInk" xmlns:wne="http://schemas.microsoft.com/office/word/2006/wordml" xmlns:wps="http://schemas.microsoft.com/office/word/2010/wordprocessingShape" mc:Ignorable="w14 w15 w16se w16cid w16 w16cex w16sdtdh w16sdtfl w16du wp14">
+  <w:p>
+    <w:pPr>
+      <w:pStyle w:val="Header"/>
+      <w:framePr w:wrap="none" w:vAnchor="text" w:hAnchor="margin" w:xAlign="right" w:y="1"/>
       <w:rPr>
         <w:rStyle w:val="PageNumber"/>
       </w:rPr>
-      <w:id w:val="-2116129608"/>
-      <w:docPartObj>
-        <w:docPartGallery w:val="Page Numbers (Top of Page)"/>
-        <w:docPartUnique/>
-      </w:docPartObj>
-    </w:sdtPr>
-    <w:sdtContent>
-      <w:p>
-        <w:pPr>
-          <w:pStyle w:val="Header"/>
-          <w:framePr w:wrap="none" w:vAnchor="text" w:hAnchor="margin" w:xAlign="right" w:y="1"/>
-          <w:rPr>
-            <w:rStyle w:val="PageNumber"/>
-          </w:rPr>
-        </w:pPr>
-        <w:r>
-          <w:rPr>
-            <w:rStyle w:val="PageNumber"/>
-          </w:rPr>
-          <w:fldChar w:fldCharType="begin"/>
-        </w:r>
-        <w:r>
-          <w:rPr>
-            <w:rStyle w:val="PageNumber"/>
-          </w:rPr>
-          <w:instrText xml:space="preserve"> PAGE </w:instrText>
-        </w:r>
-        <w:r>
-          <w:rPr>
-            <w:rStyle w:val="PageNumber"/>
-          </w:rPr>
-          <w:fldChar w:fldCharType="separate"/>
-        </w:r>
-        <w:r>
-          <w:rPr>
-            <w:rStyle w:val="PageNumber"/>
-            <w:noProof/>
-          </w:rPr>
-          <w:t>2</w:t>
-        </w:r>
-        <w:r>
-          <w:rPr>
-            <w:rStyle w:val="PageNumber"/>
-          </w:rPr>
-          <w:fldChar w:fldCharType="end"/>
-        </w:r>
-      </w:p>
-    </w:sdtContent>
-  </w:sdt>
+    </w:pPr>
+  </w:p>
   <w:p>
     <w:pPr>
       <w:pStyle w:val="Header"/>

</xml_diff>